<commit_message>
descripción breve del cambio
</commit_message>
<xml_diff>
--- a/files/Programa Nivelación Estadística 2026.docx
+++ b/files/Programa Nivelación Estadística 2026.docx
@@ -594,7 +594,6 @@
                 <w:szCs w:val="20"/>
               </w:rPr>
             </w:pPr>
-            <w:proofErr w:type="spellStart"/>
             <w:r>
               <w:rPr>
                 <w:rFonts w:ascii="Calibri" w:eastAsia="Calibri" w:hAnsi="Calibri" w:cs="Calibri"/>
@@ -604,7 +603,6 @@
               </w:rPr>
               <w:t>Webcursos</w:t>
             </w:r>
-            <w:proofErr w:type="spellEnd"/>
           </w:p>
         </w:tc>
       </w:tr>
@@ -1026,7 +1024,6 @@
               </w:rPr>
               <w:t xml:space="preserve"> que toda la comunicación académica es a través de la plataforma </w:t>
             </w:r>
-            <w:proofErr w:type="spellStart"/>
             <w:r>
               <w:rPr>
                 <w:rFonts w:ascii="Calibri" w:eastAsia="Calibri" w:hAnsi="Calibri" w:cs="Calibri"/>
@@ -1034,9 +1031,8 @@
                 <w:sz w:val="20"/>
                 <w:szCs w:val="20"/>
               </w:rPr>
-              <w:t>WebCursos</w:t>
-            </w:r>
-            <w:proofErr w:type="spellEnd"/>
+              <w:t>Web</w:t>
+            </w:r>
             <w:r>
               <w:rPr>
                 <w:rFonts w:ascii="Calibri" w:eastAsia="Calibri" w:hAnsi="Calibri" w:cs="Calibri"/>
@@ -1044,7 +1040,16 @@
                 <w:sz w:val="20"/>
                 <w:szCs w:val="20"/>
               </w:rPr>
-              <w:t>.</w:t>
+              <w:t>c</w:t>
+            </w:r>
+            <w:r>
+              <w:rPr>
+                <w:rFonts w:ascii="Calibri" w:eastAsia="Calibri" w:hAnsi="Calibri" w:cs="Calibri"/>
+                <w:b/>
+                <w:sz w:val="20"/>
+                <w:szCs w:val="20"/>
+              </w:rPr>
+              <w:t>ursos.</w:t>
             </w:r>
           </w:p>
         </w:tc>
@@ -1199,15 +1204,15 @@
                 <w:sz w:val="20"/>
                 <w:szCs w:val="20"/>
               </w:rPr>
-              <w:t>facilita la comprensión de los contenidos d</w:t>
-            </w:r>
-            <w:r>
-              <w:rPr>
-                <w:rFonts w:ascii="Calibri" w:eastAsia="Calibri" w:hAnsi="Calibri" w:cs="Calibri"/>
-                <w:sz w:val="20"/>
-                <w:szCs w:val="20"/>
-              </w:rPr>
-              <w:t>el Módulo II de Análisis de Datos y Estadística Computacional del DIAPP. No asume conocimientos previos de estadística y utiliza R como herramienta de aprendizaje desde la primera sesión.</w:t>
+              <w:t xml:space="preserve">facilitan la comprensión de contenidos cuantitativos y analíticos presentes en distintos cursos del </w:t>
+            </w:r>
+            <w:r>
+              <w:rPr>
+                <w:rFonts w:ascii="Calibri" w:eastAsia="Calibri" w:hAnsi="Calibri" w:cs="Calibri"/>
+                <w:sz w:val="20"/>
+                <w:szCs w:val="20"/>
+              </w:rPr>
+              <w:t>DIAPP. No asume conocimientos previos de estadística y utiliza R como herramienta de aprendizaje desde la primera sesión.</w:t>
             </w:r>
           </w:p>
           <w:p>
@@ -1269,7 +1274,7 @@
                 <w:sz w:val="20"/>
                 <w:szCs w:val="20"/>
               </w:rPr>
-              <w:t xml:space="preserve">y los conceptos básicos de probabilidad, incluyendo ejemplos aplicados en </w:t>
+              <w:t xml:space="preserve">incluyendo ejemplos aplicados en </w:t>
             </w:r>
             <w:r>
               <w:rPr>
@@ -1287,7 +1292,71 @@
                 <w:sz w:val="20"/>
                 <w:szCs w:val="20"/>
               </w:rPr>
-              <w:t xml:space="preserve">. La segunda clase aborda la inferencia estadística: cómo pasar de una muestra a conclusiones sobre una población, cómo construir e interpretar intervalos de confianza, y cómo leer e interpretar una prueba de hipótesis y su p-valor. </w:t>
+              <w:t>. La segunda clase aborda</w:t>
+            </w:r>
+            <w:r>
+              <w:rPr>
+                <w:rFonts w:ascii="Calibri" w:eastAsia="Calibri" w:hAnsi="Calibri" w:cs="Calibri"/>
+                <w:sz w:val="20"/>
+                <w:szCs w:val="20"/>
+              </w:rPr>
+              <w:t xml:space="preserve"> los tópicos esenciales de probabilidad e</w:t>
+            </w:r>
+            <w:r>
+              <w:rPr>
+                <w:rFonts w:ascii="Calibri" w:eastAsia="Calibri" w:hAnsi="Calibri" w:cs="Calibri"/>
+                <w:sz w:val="20"/>
+                <w:szCs w:val="20"/>
+              </w:rPr>
+              <w:t xml:space="preserve"> inferencia estadística: </w:t>
+            </w:r>
+            <w:r>
+              <w:rPr>
+                <w:rFonts w:ascii="Calibri" w:eastAsia="Calibri" w:hAnsi="Calibri" w:cs="Calibri"/>
+                <w:sz w:val="20"/>
+                <w:szCs w:val="20"/>
+              </w:rPr>
+              <w:t>c</w:t>
+            </w:r>
+            <w:r>
+              <w:rPr>
+                <w:rFonts w:ascii="Calibri" w:eastAsia="Calibri" w:hAnsi="Calibri" w:cs="Calibri"/>
+                <w:sz w:val="20"/>
+                <w:szCs w:val="20"/>
+              </w:rPr>
+              <w:t xml:space="preserve">ómo pasar de una muestra a conclusiones sobre una población, cómo construir e interpretar intervalos de confianza, y </w:t>
+            </w:r>
+            <w:r>
+              <w:rPr>
+                <w:rFonts w:ascii="Calibri" w:eastAsia="Calibri" w:hAnsi="Calibri" w:cs="Calibri"/>
+                <w:sz w:val="20"/>
+                <w:szCs w:val="20"/>
+              </w:rPr>
+              <w:t>cómo interpretar una prueba de hipótesis y el significado de su p</w:t>
+            </w:r>
+            <w:r>
+              <w:rPr>
+                <w:rFonts w:ascii="Calibri" w:eastAsia="Calibri" w:hAnsi="Calibri" w:cs="Calibri"/>
+                <w:sz w:val="20"/>
+                <w:szCs w:val="20"/>
+              </w:rPr>
+              <w:t>-</w:t>
+            </w:r>
+            <w:r>
+              <w:rPr>
+                <w:rFonts w:ascii="Calibri" w:eastAsia="Calibri" w:hAnsi="Calibri" w:cs="Calibri"/>
+                <w:sz w:val="20"/>
+                <w:szCs w:val="20"/>
+              </w:rPr>
+              <w:t>valor</w:t>
+            </w:r>
+            <w:r>
+              <w:rPr>
+                <w:rFonts w:ascii="Calibri" w:eastAsia="Calibri" w:hAnsi="Calibri" w:cs="Calibri"/>
+                <w:sz w:val="20"/>
+                <w:szCs w:val="20"/>
+              </w:rPr>
+              <w:t xml:space="preserve">. </w:t>
             </w:r>
           </w:p>
           <w:p>
@@ -1317,55 +1386,7 @@
                 <w:sz w:val="20"/>
                 <w:szCs w:val="20"/>
               </w:rPr>
-              <w:t xml:space="preserve">Estos últimos conceptos son la base directa de los </w:t>
-            </w:r>
-            <w:r>
-              <w:rPr>
-                <w:rFonts w:ascii="Calibri" w:eastAsia="Calibri" w:hAnsi="Calibri" w:cs="Calibri"/>
-                <w:sz w:val="20"/>
-                <w:szCs w:val="20"/>
-              </w:rPr>
-              <w:t>conceptos</w:t>
-            </w:r>
-            <w:r>
-              <w:rPr>
-                <w:rFonts w:ascii="Calibri" w:eastAsia="Calibri" w:hAnsi="Calibri" w:cs="Calibri"/>
-                <w:sz w:val="20"/>
-                <w:szCs w:val="20"/>
-              </w:rPr>
-              <w:t xml:space="preserve"> que se </w:t>
-            </w:r>
-            <w:r>
-              <w:rPr>
-                <w:rFonts w:ascii="Calibri" w:eastAsia="Calibri" w:hAnsi="Calibri" w:cs="Calibri"/>
-                <w:sz w:val="20"/>
-                <w:szCs w:val="20"/>
-              </w:rPr>
-              <w:t xml:space="preserve">profundizan </w:t>
-            </w:r>
-            <w:r>
-              <w:rPr>
-                <w:rFonts w:ascii="Calibri" w:eastAsia="Calibri" w:hAnsi="Calibri" w:cs="Calibri"/>
-                <w:sz w:val="20"/>
-                <w:szCs w:val="20"/>
-              </w:rPr>
-              <w:t>en el Módulo II</w:t>
-            </w:r>
-            <w:r>
-              <w:rPr>
-                <w:rFonts w:ascii="Calibri" w:eastAsia="Calibri" w:hAnsi="Calibri" w:cs="Calibri"/>
-                <w:sz w:val="20"/>
-                <w:szCs w:val="20"/>
-              </w:rPr>
-              <w:t xml:space="preserve"> del DIAPP</w:t>
-            </w:r>
-            <w:r>
-              <w:rPr>
-                <w:rFonts w:ascii="Calibri" w:eastAsia="Calibri" w:hAnsi="Calibri" w:cs="Calibri"/>
-                <w:sz w:val="20"/>
-                <w:szCs w:val="20"/>
-              </w:rPr>
-              <w:t>.</w:t>
+              <w:t>Estos contenidos constituyen una base relevante para los temas que se profundizan posteriormente en el Módulo II del DIAPP.</w:t>
             </w:r>
           </w:p>
         </w:tc>
@@ -1463,7 +1484,39 @@
                 <w:sz w:val="20"/>
                 <w:szCs w:val="20"/>
               </w:rPr>
-              <w:t xml:space="preserve"> es introducir los fundamentos de la estadística y la probabilidad mediante aplicaciones prácticas en R, preparando a los participantes para comprender e interpretar los métodos de inferencia y regresión del Módulo II de Análisis de Datos y Estadística Computacional. </w:t>
+              <w:t xml:space="preserve"> </w:t>
+            </w:r>
+            <w:r>
+              <w:rPr>
+                <w:rFonts w:ascii="Calibri" w:eastAsia="Calibri" w:hAnsi="Calibri" w:cs="Calibri"/>
+                <w:sz w:val="20"/>
+                <w:szCs w:val="20"/>
+              </w:rPr>
+              <w:t xml:space="preserve">del módulo </w:t>
+            </w:r>
+            <w:r>
+              <w:rPr>
+                <w:rFonts w:ascii="Calibri" w:eastAsia="Calibri" w:hAnsi="Calibri" w:cs="Calibri"/>
+                <w:sz w:val="20"/>
+                <w:szCs w:val="20"/>
+              </w:rPr>
+              <w:t>es introducir los fundamentos de la estadística y la probabilidad mediante aplicaciones prácticas en R, entregando herramientas básicas para comprender, interpretar y comunicar información cuantitativa en el ámbito de las políticas públicas. El módulo busca además fortalecer competencias transversales para enfrentar los distintos cursos del diplomado y desarrollar una comprensión general del análisis de datos</w:t>
+            </w:r>
+            <w:r>
+              <w:rPr>
+                <w:rFonts w:ascii="Calibri" w:eastAsia="Calibri" w:hAnsi="Calibri" w:cs="Calibri"/>
+                <w:sz w:val="20"/>
+                <w:szCs w:val="20"/>
+              </w:rPr>
+              <w:t xml:space="preserve"> y su </w:t>
+            </w:r>
+            <w:r>
+              <w:rPr>
+                <w:rFonts w:ascii="Calibri" w:eastAsia="Calibri" w:hAnsi="Calibri" w:cs="Calibri"/>
+                <w:sz w:val="20"/>
+                <w:szCs w:val="20"/>
+              </w:rPr>
+              <w:t>utilidad en la toma de decisiones.</w:t>
             </w:r>
           </w:p>
         </w:tc>
@@ -1540,6 +1593,7 @@
                 <w:sz w:val="20"/>
                 <w:szCs w:val="20"/>
               </w:rPr>
+              <w:lastRenderedPageBreak/>
               <w:t xml:space="preserve">Distinguir las dos ramas principales de la estadística </w:t>
             </w:r>
             <w:r>
@@ -1641,31 +1695,7 @@
                 <w:sz w:val="20"/>
                 <w:szCs w:val="20"/>
               </w:rPr>
-              <w:t xml:space="preserve">Entender la lógica del muestreo y la incertidumbre como base de la inferencia estadística. </w:t>
-            </w:r>
-          </w:p>
-          <w:p>
-            <w:pPr>
-              <w:widowControl/>
-              <w:numPr>
-                <w:ilvl w:val="0"/>
-                <w:numId w:val="2"/>
-              </w:numPr>
-              <w:jc w:val="both"/>
-              <w:rPr>
-                <w:rFonts w:ascii="Calibri" w:eastAsia="Calibri" w:hAnsi="Calibri" w:cs="Calibri"/>
-                <w:sz w:val="20"/>
-                <w:szCs w:val="20"/>
-              </w:rPr>
-            </w:pPr>
-            <w:r>
-              <w:rPr>
-                <w:rFonts w:ascii="Calibri" w:eastAsia="Calibri" w:hAnsi="Calibri" w:cs="Calibri"/>
-                <w:sz w:val="20"/>
-                <w:szCs w:val="20"/>
-              </w:rPr>
-              <w:lastRenderedPageBreak/>
-              <w:t>Interpretar intervalos de confianza y pruebas de hipótesis, reconociendo su conexión directa con los modelos de regresión del Módulo II.</w:t>
+              <w:t>Interpretar intervalos de confianza y pruebas de hipótesis como herramientas básicas para el análisis e interpretación de evidencia cuantitativa.</w:t>
             </w:r>
           </w:p>
         </w:tc>
@@ -1850,12 +1880,7 @@
           </w:tcPr>
           <w:p>
             <w:pPr>
-              <w:pStyle w:val="Prrafodelista"/>
               <w:widowControl/>
-              <w:numPr>
-                <w:ilvl w:val="0"/>
-                <w:numId w:val="21"/>
-              </w:numPr>
               <w:pBdr>
                 <w:top w:val="nil"/>
                 <w:left w:val="nil"/>
@@ -2059,27 +2084,7 @@
                 <w:sz w:val="20"/>
                 <w:szCs w:val="20"/>
               </w:rPr>
-              <w:t xml:space="preserve">Estadística descriptiva para variables numéricas: tendencia central (media y mediana), variabilidad (varianza y desviación estándar), visualización (histograma y </w:t>
-            </w:r>
-            <w:proofErr w:type="spellStart"/>
-            <w:r>
-              <w:rPr>
-                <w:rFonts w:ascii="Calibri" w:eastAsia="Calibri" w:hAnsi="Calibri" w:cs="Calibri"/>
-                <w:color w:val="000000"/>
-                <w:sz w:val="20"/>
-                <w:szCs w:val="20"/>
-              </w:rPr>
-              <w:t>boxplot</w:t>
-            </w:r>
-            <w:proofErr w:type="spellEnd"/>
-            <w:r>
-              <w:rPr>
-                <w:rFonts w:ascii="Calibri" w:eastAsia="Calibri" w:hAnsi="Calibri" w:cs="Calibri"/>
-                <w:color w:val="000000"/>
-                <w:sz w:val="20"/>
-                <w:szCs w:val="20"/>
-              </w:rPr>
-              <w:t>).</w:t>
+              <w:t>Estadística descriptiva para variables numéricas: tendencia central (media y mediana), variabilidad (varianza y desviación estándar), visualización (histograma y boxplot).</w:t>
             </w:r>
           </w:p>
           <w:p>
@@ -2112,212 +2117,7 @@
                 <w:sz w:val="20"/>
                 <w:szCs w:val="20"/>
               </w:rPr>
-              <w:t xml:space="preserve">Estadística descriptiva </w:t>
-            </w:r>
-            <w:proofErr w:type="spellStart"/>
-            <w:r>
-              <w:rPr>
-                <w:rFonts w:ascii="Calibri" w:eastAsia="Calibri" w:hAnsi="Calibri" w:cs="Calibri"/>
-                <w:color w:val="000000"/>
-                <w:sz w:val="20"/>
-                <w:szCs w:val="20"/>
-              </w:rPr>
-              <w:t>bivariada</w:t>
-            </w:r>
-            <w:proofErr w:type="spellEnd"/>
-            <w:r>
-              <w:rPr>
-                <w:rFonts w:ascii="Calibri" w:eastAsia="Calibri" w:hAnsi="Calibri" w:cs="Calibri"/>
-                <w:color w:val="000000"/>
-                <w:sz w:val="20"/>
-                <w:szCs w:val="20"/>
-              </w:rPr>
-              <w:t xml:space="preserve">: correlación y </w:t>
-            </w:r>
-            <w:proofErr w:type="spellStart"/>
-            <w:r>
-              <w:rPr>
-                <w:rFonts w:ascii="Calibri" w:eastAsia="Calibri" w:hAnsi="Calibri" w:cs="Calibri"/>
-                <w:color w:val="000000"/>
-                <w:sz w:val="20"/>
-                <w:szCs w:val="20"/>
-              </w:rPr>
-              <w:t>scatterplot</w:t>
-            </w:r>
-            <w:proofErr w:type="spellEnd"/>
-          </w:p>
-          <w:p>
-            <w:pPr>
-              <w:pStyle w:val="Prrafodelista"/>
-              <w:widowControl/>
-              <w:numPr>
-                <w:ilvl w:val="0"/>
-                <w:numId w:val="21"/>
-              </w:numPr>
-              <w:pBdr>
-                <w:top w:val="nil"/>
-                <w:left w:val="nil"/>
-                <w:bottom w:val="nil"/>
-                <w:right w:val="nil"/>
-                <w:between w:val="nil"/>
-              </w:pBdr>
-              <w:jc w:val="both"/>
-              <w:rPr>
-                <w:b/>
-                <w:bCs/>
-                <w:color w:val="000000"/>
-              </w:rPr>
-            </w:pPr>
-            <w:r>
-              <w:rPr>
-                <w:rFonts w:ascii="Calibri" w:eastAsia="Calibri" w:hAnsi="Calibri" w:cs="Calibri"/>
-                <w:b/>
-                <w:bCs/>
-                <w:sz w:val="20"/>
-                <w:szCs w:val="20"/>
-              </w:rPr>
-              <w:t>Introducción a la probabilidad</w:t>
-            </w:r>
-          </w:p>
-          <w:p>
-            <w:pPr>
-              <w:pStyle w:val="Prrafodelista"/>
-              <w:widowControl/>
-              <w:numPr>
-                <w:ilvl w:val="0"/>
-                <w:numId w:val="22"/>
-              </w:numPr>
-              <w:pBdr>
-                <w:top w:val="nil"/>
-                <w:left w:val="nil"/>
-                <w:bottom w:val="nil"/>
-                <w:right w:val="nil"/>
-                <w:between w:val="nil"/>
-              </w:pBdr>
-              <w:jc w:val="both"/>
-              <w:rPr>
-                <w:b/>
-                <w:bCs/>
-                <w:color w:val="000000"/>
-              </w:rPr>
-            </w:pPr>
-            <w:r>
-              <w:rPr>
-                <w:rFonts w:ascii="Calibri" w:eastAsia="Calibri" w:hAnsi="Calibri" w:cs="Calibri"/>
-                <w:color w:val="000000"/>
-                <w:sz w:val="20"/>
-                <w:szCs w:val="20"/>
-              </w:rPr>
-              <w:t>Definición y reglas básicas.</w:t>
-            </w:r>
-          </w:p>
-          <w:p>
-            <w:pPr>
-              <w:pStyle w:val="Prrafodelista"/>
-              <w:widowControl/>
-              <w:numPr>
-                <w:ilvl w:val="0"/>
-                <w:numId w:val="22"/>
-              </w:numPr>
-              <w:pBdr>
-                <w:top w:val="nil"/>
-                <w:left w:val="nil"/>
-                <w:bottom w:val="nil"/>
-                <w:right w:val="nil"/>
-                <w:between w:val="nil"/>
-              </w:pBdr>
-              <w:jc w:val="both"/>
-              <w:rPr>
-                <w:b/>
-                <w:bCs/>
-                <w:color w:val="000000"/>
-              </w:rPr>
-            </w:pPr>
-            <w:r>
-              <w:rPr>
-                <w:rFonts w:ascii="Calibri" w:eastAsia="Calibri" w:hAnsi="Calibri" w:cs="Calibri"/>
-                <w:color w:val="000000"/>
-                <w:sz w:val="20"/>
-                <w:szCs w:val="20"/>
-              </w:rPr>
-              <w:t>Probabilidad condicional e independencia.</w:t>
-            </w:r>
-          </w:p>
-          <w:p>
-            <w:pPr>
-              <w:pStyle w:val="Prrafodelista"/>
-              <w:widowControl/>
-              <w:numPr>
-                <w:ilvl w:val="0"/>
-                <w:numId w:val="22"/>
-              </w:numPr>
-              <w:pBdr>
-                <w:top w:val="nil"/>
-                <w:left w:val="nil"/>
-                <w:bottom w:val="nil"/>
-                <w:right w:val="nil"/>
-                <w:between w:val="nil"/>
-              </w:pBdr>
-              <w:jc w:val="both"/>
-              <w:rPr>
-                <w:b/>
-                <w:bCs/>
-                <w:color w:val="000000"/>
-              </w:rPr>
-            </w:pPr>
-            <w:r>
-              <w:rPr>
-                <w:rFonts w:ascii="Calibri" w:eastAsia="Calibri" w:hAnsi="Calibri" w:cs="Calibri"/>
-                <w:color w:val="000000"/>
-                <w:sz w:val="20"/>
-                <w:szCs w:val="20"/>
-              </w:rPr>
-              <w:t>Simulación de probabilidades en R</w:t>
-            </w:r>
-            <w:r>
-              <w:rPr>
-                <w:rFonts w:ascii="Calibri" w:eastAsia="Calibri" w:hAnsi="Calibri" w:cs="Calibri"/>
-                <w:color w:val="000000"/>
-                <w:sz w:val="20"/>
-                <w:szCs w:val="20"/>
-              </w:rPr>
-              <w:t xml:space="preserve"> y</w:t>
-            </w:r>
-            <w:r>
-              <w:rPr>
-                <w:rFonts w:ascii="Calibri" w:eastAsia="Calibri" w:hAnsi="Calibri" w:cs="Calibri"/>
-                <w:color w:val="000000"/>
-                <w:sz w:val="20"/>
-                <w:szCs w:val="20"/>
-              </w:rPr>
-              <w:t xml:space="preserve"> </w:t>
-            </w:r>
-            <w:r>
-              <w:rPr>
-                <w:rFonts w:ascii="Calibri" w:eastAsia="Calibri" w:hAnsi="Calibri" w:cs="Calibri"/>
-                <w:color w:val="000000"/>
-                <w:sz w:val="20"/>
-                <w:szCs w:val="20"/>
-              </w:rPr>
-              <w:t>e</w:t>
-            </w:r>
-            <w:r>
-              <w:rPr>
-                <w:rFonts w:ascii="Calibri" w:eastAsia="Calibri" w:hAnsi="Calibri" w:cs="Calibri"/>
-                <w:color w:val="000000"/>
-                <w:sz w:val="20"/>
-                <w:szCs w:val="20"/>
-              </w:rPr>
-              <w:t>jemplo aplicado</w:t>
-            </w:r>
-            <w:r>
-              <w:rPr>
-                <w:rFonts w:ascii="Calibri" w:eastAsia="Calibri" w:hAnsi="Calibri" w:cs="Calibri"/>
-                <w:color w:val="000000"/>
-                <w:sz w:val="20"/>
-                <w:szCs w:val="20"/>
-              </w:rPr>
-              <w:t>s</w:t>
+              <w:t>Estadística descriptiva bivariada: correlación y scatterplot</w:t>
             </w:r>
           </w:p>
         </w:tc>
@@ -2435,71 +2235,6 @@
               <w:t>)</w:t>
             </w:r>
           </w:p>
-          <w:p>
-            <w:pPr>
-              <w:widowControl/>
-              <w:numPr>
-                <w:ilvl w:val="0"/>
-                <w:numId w:val="8"/>
-              </w:numPr>
-              <w:pBdr>
-                <w:top w:val="nil"/>
-                <w:left w:val="nil"/>
-                <w:bottom w:val="nil"/>
-                <w:right w:val="nil"/>
-                <w:between w:val="nil"/>
-              </w:pBdr>
-              <w:spacing w:before="1"/>
-              <w:jc w:val="both"/>
-              <w:rPr>
-                <w:rFonts w:ascii="Calibri" w:eastAsia="Calibri" w:hAnsi="Calibri" w:cs="Calibri"/>
-                <w:b/>
-                <w:color w:val="000000"/>
-                <w:sz w:val="20"/>
-                <w:szCs w:val="20"/>
-              </w:rPr>
-            </w:pPr>
-            <w:r>
-              <w:rPr>
-                <w:rFonts w:ascii="Calibri" w:eastAsia="Calibri" w:hAnsi="Calibri" w:cs="Calibri"/>
-                <w:b/>
-                <w:color w:val="000000"/>
-                <w:sz w:val="20"/>
-                <w:szCs w:val="20"/>
-              </w:rPr>
-              <w:t>I</w:t>
-            </w:r>
-            <w:r>
-              <w:rPr>
-                <w:rFonts w:ascii="Calibri" w:eastAsia="Calibri" w:hAnsi="Calibri" w:cs="Calibri"/>
-                <w:b/>
-                <w:color w:val="000000"/>
-                <w:sz w:val="20"/>
-                <w:szCs w:val="20"/>
-              </w:rPr>
-              <w:t>&amp;W</w:t>
-            </w:r>
-            <w:r>
-              <w:rPr>
-                <w:rFonts w:ascii="Calibri" w:eastAsia="Calibri" w:hAnsi="Calibri" w:cs="Calibri"/>
-                <w:b/>
-                <w:color w:val="000000"/>
-                <w:sz w:val="20"/>
-                <w:szCs w:val="20"/>
-              </w:rPr>
-              <w:t xml:space="preserve"> </w:t>
-            </w:r>
-            <w:r>
-              <w:rPr>
-                <w:rFonts w:ascii="Calibri" w:eastAsia="Calibri" w:hAnsi="Calibri" w:cs="Calibri"/>
-                <w:b/>
-                <w:color w:val="000000"/>
-                <w:sz w:val="20"/>
-                <w:szCs w:val="20"/>
-              </w:rPr>
-              <w:t>(6)</w:t>
-            </w:r>
-          </w:p>
         </w:tc>
       </w:tr>
       <w:tr>
@@ -2535,22 +2270,195 @@
           <w:p>
             <w:pPr>
               <w:widowControl/>
+              <w:pBdr>
+                <w:top w:val="nil"/>
+                <w:left w:val="nil"/>
+                <w:bottom w:val="nil"/>
+                <w:right w:val="nil"/>
+                <w:between w:val="nil"/>
+              </w:pBdr>
               <w:jc w:val="both"/>
               <w:rPr>
-                <w:rFonts w:ascii="Calibri" w:eastAsia="Calibri" w:hAnsi="Calibri" w:cs="Calibri"/>
                 <w:b/>
-                <w:sz w:val="20"/>
-                <w:szCs w:val="20"/>
+                <w:bCs/>
+                <w:color w:val="000000"/>
               </w:rPr>
             </w:pPr>
             <w:r>
               <w:rPr>
                 <w:rFonts w:ascii="Calibri" w:eastAsia="Calibri" w:hAnsi="Calibri" w:cs="Calibri"/>
                 <w:b/>
-                <w:sz w:val="20"/>
-                <w:szCs w:val="20"/>
-              </w:rPr>
-              <w:t>Inferencia Estadística</w:t>
+                <w:bCs/>
+                <w:sz w:val="20"/>
+                <w:szCs w:val="20"/>
+              </w:rPr>
+              <w:t>Introducción a la probabilidad</w:t>
+            </w:r>
+          </w:p>
+          <w:p>
+            <w:pPr>
+              <w:pStyle w:val="Prrafodelista"/>
+              <w:widowControl/>
+              <w:numPr>
+                <w:ilvl w:val="0"/>
+                <w:numId w:val="22"/>
+              </w:numPr>
+              <w:pBdr>
+                <w:top w:val="nil"/>
+                <w:left w:val="nil"/>
+                <w:bottom w:val="nil"/>
+                <w:right w:val="nil"/>
+                <w:between w:val="nil"/>
+              </w:pBdr>
+              <w:jc w:val="both"/>
+              <w:rPr>
+                <w:b/>
+                <w:bCs/>
+                <w:color w:val="000000"/>
+              </w:rPr>
+            </w:pPr>
+            <w:r>
+              <w:rPr>
+                <w:rFonts w:ascii="Calibri" w:eastAsia="Calibri" w:hAnsi="Calibri" w:cs="Calibri"/>
+                <w:color w:val="000000"/>
+                <w:sz w:val="20"/>
+                <w:szCs w:val="20"/>
+              </w:rPr>
+              <w:t>Definición y reglas básicas.</w:t>
+            </w:r>
+          </w:p>
+          <w:p>
+            <w:pPr>
+              <w:pStyle w:val="Prrafodelista"/>
+              <w:widowControl/>
+              <w:numPr>
+                <w:ilvl w:val="0"/>
+                <w:numId w:val="22"/>
+              </w:numPr>
+              <w:pBdr>
+                <w:top w:val="nil"/>
+                <w:left w:val="nil"/>
+                <w:bottom w:val="nil"/>
+                <w:right w:val="nil"/>
+                <w:between w:val="nil"/>
+              </w:pBdr>
+              <w:jc w:val="both"/>
+              <w:rPr>
+                <w:rFonts w:ascii="Calibri" w:eastAsia="Calibri" w:hAnsi="Calibri" w:cs="Calibri"/>
+                <w:b/>
+                <w:sz w:val="20"/>
+                <w:szCs w:val="20"/>
+              </w:rPr>
+            </w:pPr>
+            <w:r>
+              <w:rPr>
+                <w:rFonts w:ascii="Calibri" w:eastAsia="Calibri" w:hAnsi="Calibri" w:cs="Calibri"/>
+                <w:color w:val="000000"/>
+                <w:sz w:val="20"/>
+                <w:szCs w:val="20"/>
+              </w:rPr>
+              <w:t>Probabilidad condicional e independencia.</w:t>
+            </w:r>
+          </w:p>
+          <w:p>
+            <w:pPr>
+              <w:pStyle w:val="Prrafodelista"/>
+              <w:widowControl/>
+              <w:numPr>
+                <w:ilvl w:val="0"/>
+                <w:numId w:val="22"/>
+              </w:numPr>
+              <w:pBdr>
+                <w:top w:val="nil"/>
+                <w:left w:val="nil"/>
+                <w:bottom w:val="nil"/>
+                <w:right w:val="nil"/>
+                <w:between w:val="nil"/>
+              </w:pBdr>
+              <w:jc w:val="both"/>
+              <w:rPr>
+                <w:rFonts w:ascii="Calibri" w:eastAsia="Calibri" w:hAnsi="Calibri" w:cs="Calibri"/>
+                <w:b/>
+                <w:sz w:val="20"/>
+                <w:szCs w:val="20"/>
+              </w:rPr>
+            </w:pPr>
+            <w:r>
+              <w:rPr>
+                <w:rFonts w:ascii="Calibri" w:eastAsia="Calibri" w:hAnsi="Calibri" w:cs="Calibri"/>
+                <w:color w:val="000000"/>
+                <w:sz w:val="20"/>
+                <w:szCs w:val="20"/>
+              </w:rPr>
+              <w:t>Simulación de probabilidades en R y ejemplo</w:t>
+            </w:r>
+            <w:r>
+              <w:rPr>
+                <w:rFonts w:ascii="Calibri" w:eastAsia="Calibri" w:hAnsi="Calibri" w:cs="Calibri"/>
+                <w:color w:val="000000"/>
+                <w:sz w:val="20"/>
+                <w:szCs w:val="20"/>
+              </w:rPr>
+              <w:t>s</w:t>
+            </w:r>
+            <w:r>
+              <w:rPr>
+                <w:rFonts w:ascii="Calibri" w:eastAsia="Calibri" w:hAnsi="Calibri" w:cs="Calibri"/>
+                <w:color w:val="000000"/>
+                <w:sz w:val="20"/>
+                <w:szCs w:val="20"/>
+              </w:rPr>
+              <w:t xml:space="preserve"> aplicados</w:t>
+            </w:r>
+          </w:p>
+          <w:p>
+            <w:pPr>
+              <w:widowControl/>
+              <w:pBdr>
+                <w:top w:val="nil"/>
+                <w:left w:val="nil"/>
+                <w:bottom w:val="nil"/>
+                <w:right w:val="nil"/>
+                <w:between w:val="nil"/>
+              </w:pBdr>
+              <w:jc w:val="both"/>
+              <w:rPr>
+                <w:rFonts w:ascii="Calibri" w:eastAsia="Calibri" w:hAnsi="Calibri" w:cs="Calibri"/>
+                <w:b/>
+                <w:bCs/>
+                <w:sz w:val="20"/>
+                <w:szCs w:val="20"/>
+              </w:rPr>
+            </w:pPr>
+            <w:r>
+              <w:rPr>
+                <w:rFonts w:ascii="Calibri" w:eastAsia="Calibri" w:hAnsi="Calibri" w:cs="Calibri"/>
+                <w:b/>
+                <w:bCs/>
+                <w:sz w:val="20"/>
+                <w:szCs w:val="20"/>
+              </w:rPr>
+              <w:t xml:space="preserve">Inferencia </w:t>
+            </w:r>
+            <w:r>
+              <w:rPr>
+                <w:rFonts w:ascii="Calibri" w:eastAsia="Calibri" w:hAnsi="Calibri" w:cs="Calibri"/>
+                <w:b/>
+                <w:bCs/>
+                <w:sz w:val="20"/>
+                <w:szCs w:val="20"/>
+              </w:rPr>
+              <w:t>e</w:t>
+            </w:r>
+            <w:r>
+              <w:rPr>
+                <w:rFonts w:ascii="Calibri" w:eastAsia="Calibri" w:hAnsi="Calibri" w:cs="Calibri"/>
+                <w:b/>
+                <w:bCs/>
+                <w:sz w:val="20"/>
+                <w:szCs w:val="20"/>
+              </w:rPr>
+              <w:t>stadística</w:t>
             </w:r>
           </w:p>
           <w:p>
@@ -2733,7 +2641,25 @@
                 <w:sz w:val="20"/>
                 <w:szCs w:val="20"/>
               </w:rPr>
-              <w:t xml:space="preserve">Estadístico de prueba y p-valor. </w:t>
+              <w:t>Estadístico de prueba y p</w:t>
+            </w:r>
+            <w:r>
+              <w:rPr>
+                <w:rFonts w:ascii="Calibri" w:eastAsia="Calibri" w:hAnsi="Calibri" w:cs="Calibri"/>
+                <w:color w:val="000000"/>
+                <w:sz w:val="20"/>
+                <w:szCs w:val="20"/>
+              </w:rPr>
+              <w:t>-</w:t>
+            </w:r>
+            <w:r>
+              <w:rPr>
+                <w:rFonts w:ascii="Calibri" w:eastAsia="Calibri" w:hAnsi="Calibri" w:cs="Calibri"/>
+                <w:color w:val="000000"/>
+                <w:sz w:val="20"/>
+                <w:szCs w:val="20"/>
+              </w:rPr>
+              <w:t xml:space="preserve">valor. </w:t>
             </w:r>
           </w:p>
           <w:p>
@@ -2825,7 +2751,7 @@
                 <w:sz w:val="20"/>
                 <w:szCs w:val="20"/>
               </w:rPr>
-              <w:t>IMS2 (11, 12, 13)</w:t>
+              <w:t>IMS2 (11, 13)</w:t>
             </w:r>
           </w:p>
           <w:p>
@@ -2982,7 +2908,43 @@
                 <w:sz w:val="20"/>
                 <w:szCs w:val="20"/>
               </w:rPr>
-              <w:t>Cada sesión tiene una duración de 2 horas y combina exposición conceptual breve con práctica inmediata en R. La</w:t>
+              <w:t xml:space="preserve">Cada sesión </w:t>
+            </w:r>
+            <w:r>
+              <w:rPr>
+                <w:rFonts w:ascii="Calibri" w:eastAsia="Calibri" w:hAnsi="Calibri" w:cs="Calibri"/>
+                <w:color w:val="000000"/>
+                <w:sz w:val="20"/>
+                <w:szCs w:val="20"/>
+              </w:rPr>
+              <w:t xml:space="preserve">tendrá </w:t>
+            </w:r>
+            <w:r>
+              <w:rPr>
+                <w:rFonts w:ascii="Calibri" w:eastAsia="Calibri" w:hAnsi="Calibri" w:cs="Calibri"/>
+                <w:color w:val="000000"/>
+                <w:sz w:val="20"/>
+                <w:szCs w:val="20"/>
+              </w:rPr>
+              <w:t>una duración de 2 horas</w:t>
+            </w:r>
+            <w:r>
+              <w:rPr>
+                <w:rFonts w:ascii="Calibri" w:eastAsia="Calibri" w:hAnsi="Calibri" w:cs="Calibri"/>
+                <w:color w:val="000000"/>
+                <w:sz w:val="20"/>
+                <w:szCs w:val="20"/>
+              </w:rPr>
+              <w:t xml:space="preserve"> y 30 minutos</w:t>
+            </w:r>
+            <w:r>
+              <w:rPr>
+                <w:rFonts w:ascii="Calibri" w:eastAsia="Calibri" w:hAnsi="Calibri" w:cs="Calibri"/>
+                <w:color w:val="000000"/>
+                <w:sz w:val="20"/>
+                <w:szCs w:val="20"/>
+              </w:rPr>
+              <w:t xml:space="preserve"> y combina exposición conceptual breve con práctica inmediata en R. La</w:t>
             </w:r>
             <w:r>
               <w:rPr>
@@ -3073,7 +3035,70 @@
                 <w:sz w:val="20"/>
                 <w:szCs w:val="20"/>
               </w:rPr>
-              <w:t xml:space="preserve"> Introducción del concepto con ejemplos motivadores extraídos de contextos de política pública chilena.</w:t>
+              <w:t xml:space="preserve"> </w:t>
+            </w:r>
+            <w:r>
+              <w:rPr>
+                <w:rFonts w:ascii="Calibri" w:eastAsia="Calibri" w:hAnsi="Calibri" w:cs="Calibri"/>
+                <w:color w:val="000000"/>
+                <w:sz w:val="20"/>
+                <w:szCs w:val="20"/>
+              </w:rPr>
+              <w:t>Explicación</w:t>
+            </w:r>
+            <w:r>
+              <w:rPr>
+                <w:rFonts w:ascii="Calibri" w:eastAsia="Calibri" w:hAnsi="Calibri" w:cs="Calibri"/>
+                <w:color w:val="000000"/>
+                <w:sz w:val="20"/>
+                <w:szCs w:val="20"/>
+              </w:rPr>
+              <w:t xml:space="preserve"> de concepto</w:t>
+            </w:r>
+            <w:r>
+              <w:rPr>
+                <w:rFonts w:ascii="Calibri" w:eastAsia="Calibri" w:hAnsi="Calibri" w:cs="Calibri"/>
+                <w:color w:val="000000"/>
+                <w:sz w:val="20"/>
+                <w:szCs w:val="20"/>
+              </w:rPr>
+              <w:t>s</w:t>
+            </w:r>
+            <w:r>
+              <w:rPr>
+                <w:rFonts w:ascii="Calibri" w:eastAsia="Calibri" w:hAnsi="Calibri" w:cs="Calibri"/>
+                <w:color w:val="000000"/>
+                <w:sz w:val="20"/>
+                <w:szCs w:val="20"/>
+              </w:rPr>
+              <w:t xml:space="preserve"> </w:t>
+            </w:r>
+            <w:r>
+              <w:rPr>
+                <w:rFonts w:ascii="Calibri" w:eastAsia="Calibri" w:hAnsi="Calibri" w:cs="Calibri"/>
+                <w:color w:val="000000"/>
+                <w:sz w:val="20"/>
+                <w:szCs w:val="20"/>
+              </w:rPr>
+              <w:t xml:space="preserve">teóricos y exposición de </w:t>
+            </w:r>
+            <w:r>
+              <w:rPr>
+                <w:rFonts w:ascii="Calibri" w:eastAsia="Calibri" w:hAnsi="Calibri" w:cs="Calibri"/>
+                <w:color w:val="000000"/>
+                <w:sz w:val="20"/>
+                <w:szCs w:val="20"/>
+              </w:rPr>
+              <w:t xml:space="preserve">ejemplos </w:t>
+            </w:r>
+            <w:r>
+              <w:rPr>
+                <w:rFonts w:ascii="Calibri" w:eastAsia="Calibri" w:hAnsi="Calibri" w:cs="Calibri"/>
+                <w:color w:val="000000"/>
+                <w:sz w:val="20"/>
+                <w:szCs w:val="20"/>
+              </w:rPr>
+              <w:t>y preguntas aplicadas con casos y/o datos reales.</w:t>
             </w:r>
           </w:p>
           <w:p>
@@ -3117,7 +3142,34 @@
                 <w:sz w:val="20"/>
                 <w:szCs w:val="20"/>
               </w:rPr>
-              <w:t xml:space="preserve"> Demostración en R resuelta por el profesor, que los participantes replican en su propio equipo.</w:t>
+              <w:t xml:space="preserve"> </w:t>
+            </w:r>
+            <w:r>
+              <w:rPr>
+                <w:rFonts w:ascii="Calibri" w:eastAsia="Calibri" w:hAnsi="Calibri" w:cs="Calibri"/>
+                <w:color w:val="000000"/>
+                <w:sz w:val="20"/>
+                <w:szCs w:val="20"/>
+              </w:rPr>
+              <w:t xml:space="preserve">Ejercicios de práctica con código en </w:t>
+            </w:r>
+            <w:r>
+              <w:rPr>
+                <w:rFonts w:ascii="Calibri" w:eastAsia="Calibri" w:hAnsi="Calibri" w:cs="Calibri"/>
+                <w:color w:val="000000"/>
+                <w:sz w:val="20"/>
+                <w:szCs w:val="20"/>
+              </w:rPr>
+              <w:t xml:space="preserve">R </w:t>
+            </w:r>
+            <w:r>
+              <w:rPr>
+                <w:rFonts w:ascii="Calibri" w:eastAsia="Calibri" w:hAnsi="Calibri" w:cs="Calibri"/>
+                <w:color w:val="000000"/>
+                <w:sz w:val="20"/>
+                <w:szCs w:val="20"/>
+              </w:rPr>
+              <w:t>en donde el profesor guía la resolución paso a paso de manera que los alumnos puedan replicar los resultados desde sus computadores.</w:t>
             </w:r>
           </w:p>
           <w:p>
@@ -3219,83 +3271,57 @@
                 <w:sz w:val="20"/>
                 <w:szCs w:val="20"/>
               </w:rPr>
-              <w:t xml:space="preserve">Se espera que los participantes asistan con R y </w:t>
-            </w:r>
-            <w:proofErr w:type="spellStart"/>
-            <w:r>
-              <w:rPr>
-                <w:rFonts w:ascii="Calibri" w:eastAsia="Calibri" w:hAnsi="Calibri" w:cs="Calibri"/>
+              <w:t xml:space="preserve">Se espera que los participantes asistan con </w:t>
+            </w:r>
+            <w:r>
+              <w:rPr>
+                <w:rFonts w:ascii="Calibri" w:eastAsia="Calibri" w:hAnsi="Calibri" w:cs="Calibri"/>
+                <w:b/>
+                <w:bCs/>
+                <w:color w:val="000000"/>
+                <w:sz w:val="20"/>
+                <w:szCs w:val="20"/>
+              </w:rPr>
+              <w:t>R</w:t>
+            </w:r>
+            <w:r>
+              <w:rPr>
+                <w:rFonts w:ascii="Calibri" w:eastAsia="Calibri" w:hAnsi="Calibri" w:cs="Calibri"/>
+                <w:color w:val="000000"/>
+                <w:sz w:val="20"/>
+                <w:szCs w:val="20"/>
+              </w:rPr>
+              <w:t xml:space="preserve"> y </w:t>
+            </w:r>
+            <w:r>
+              <w:rPr>
+                <w:rFonts w:ascii="Calibri" w:eastAsia="Calibri" w:hAnsi="Calibri" w:cs="Calibri"/>
+                <w:b/>
+                <w:bCs/>
                 <w:color w:val="000000"/>
                 <w:sz w:val="20"/>
                 <w:szCs w:val="20"/>
               </w:rPr>
               <w:t>RStudio</w:t>
             </w:r>
-            <w:proofErr w:type="spellEnd"/>
-            <w:r>
-              <w:rPr>
-                <w:rFonts w:ascii="Calibri" w:eastAsia="Calibri" w:hAnsi="Calibri" w:cs="Calibri"/>
-                <w:color w:val="000000"/>
-                <w:sz w:val="20"/>
-                <w:szCs w:val="20"/>
-              </w:rPr>
-              <w:t xml:space="preserve"> instalados.</w:t>
-            </w:r>
-            <w:r>
-              <w:rPr>
-                <w:rFonts w:ascii="Calibri" w:eastAsia="Calibri" w:hAnsi="Calibri" w:cs="Calibri"/>
-                <w:color w:val="000000"/>
-                <w:sz w:val="20"/>
-                <w:szCs w:val="20"/>
-              </w:rPr>
-              <w:t xml:space="preserve"> Quienes tengan problemas con la instalación pueden utilizar la plataforma de Google </w:t>
-            </w:r>
-            <w:proofErr w:type="spellStart"/>
-            <w:r>
-              <w:rPr>
-                <w:rFonts w:ascii="Calibri" w:eastAsia="Calibri" w:hAnsi="Calibri" w:cs="Calibri"/>
-                <w:color w:val="000000"/>
-                <w:sz w:val="20"/>
-                <w:szCs w:val="20"/>
-              </w:rPr>
-              <w:t>colab</w:t>
-            </w:r>
-            <w:proofErr w:type="spellEnd"/>
-            <w:r>
-              <w:rPr>
-                <w:rFonts w:ascii="Calibri" w:eastAsia="Calibri" w:hAnsi="Calibri" w:cs="Calibri"/>
-                <w:color w:val="000000"/>
-                <w:sz w:val="20"/>
-                <w:szCs w:val="20"/>
-              </w:rPr>
-              <w:t xml:space="preserve"> y/o </w:t>
-            </w:r>
-            <w:r>
-              <w:rPr>
-                <w:rFonts w:ascii="Calibri" w:eastAsia="Calibri" w:hAnsi="Calibri" w:cs="Calibri"/>
-                <w:color w:val="000000"/>
-                <w:sz w:val="20"/>
-                <w:szCs w:val="20"/>
-              </w:rPr>
-              <w:t xml:space="preserve">pedir apoyo </w:t>
-            </w:r>
-            <w:r>
-              <w:rPr>
-                <w:rFonts w:ascii="Calibri" w:eastAsia="Calibri" w:hAnsi="Calibri" w:cs="Calibri"/>
-                <w:color w:val="000000"/>
-                <w:sz w:val="20"/>
-                <w:szCs w:val="20"/>
-              </w:rPr>
-              <w:t>al ayudante.</w:t>
-            </w:r>
-            <w:r>
-              <w:rPr>
-                <w:rFonts w:ascii="Calibri" w:eastAsia="Calibri" w:hAnsi="Calibri" w:cs="Calibri"/>
-                <w:color w:val="000000"/>
-                <w:sz w:val="20"/>
-                <w:szCs w:val="20"/>
-              </w:rPr>
-              <w:t xml:space="preserve"> No se requiere experiencia previa en programación. Todos los materiales de cada sesión </w:t>
+            <w:r>
+              <w:rPr>
+                <w:rFonts w:ascii="Calibri" w:eastAsia="Calibri" w:hAnsi="Calibri" w:cs="Calibri"/>
+                <w:color w:val="000000"/>
+                <w:sz w:val="20"/>
+                <w:szCs w:val="20"/>
+              </w:rPr>
+              <w:t xml:space="preserve"> previamente instalados. Sin embargo, no será un requisito indispensable para el desarrollo de las actividades prácticas durante las clases. Quienes presenten dificultades con la descarga, instalación o uso de estos programas podrán solicitar apoyo al ayudante y utilizar Google Colab </w:t>
+            </w:r>
+            <w:r>
+              <w:rPr>
+                <w:rFonts w:ascii="Calibri" w:eastAsia="Calibri" w:hAnsi="Calibri" w:cs="Calibri"/>
+                <w:color w:val="000000"/>
+                <w:sz w:val="20"/>
+                <w:szCs w:val="20"/>
+              </w:rPr>
+              <w:lastRenderedPageBreak/>
+              <w:t xml:space="preserve">como alternativa para ejecutar código. No se requiere experiencia previa en programación. Todos los materiales de cada sesión </w:t>
             </w:r>
             <w:r>
               <w:rPr>
@@ -3313,45 +3339,25 @@
                 <w:sz w:val="20"/>
                 <w:szCs w:val="20"/>
               </w:rPr>
-              <w:t>presentación, código y guía de ejercicios</w:t>
-            </w:r>
-            <w:r>
-              <w:rPr>
-                <w:rFonts w:ascii="Calibri" w:eastAsia="Calibri" w:hAnsi="Calibri" w:cs="Calibri"/>
-                <w:color w:val="000000"/>
-                <w:sz w:val="20"/>
-                <w:szCs w:val="20"/>
-              </w:rPr>
-              <w:t>)</w:t>
-            </w:r>
-            <w:r>
-              <w:rPr>
-                <w:rFonts w:ascii="Calibri" w:eastAsia="Calibri" w:hAnsi="Calibri" w:cs="Calibri"/>
-                <w:color w:val="000000"/>
-                <w:sz w:val="20"/>
-                <w:szCs w:val="20"/>
-              </w:rPr>
-              <w:t xml:space="preserve"> estarán disponibles en </w:t>
-            </w:r>
-            <w:proofErr w:type="spellStart"/>
-            <w:r>
-              <w:rPr>
-                <w:rFonts w:ascii="Calibri" w:eastAsia="Calibri" w:hAnsi="Calibri" w:cs="Calibri"/>
-                <w:color w:val="000000"/>
-                <w:sz w:val="20"/>
-                <w:szCs w:val="20"/>
-              </w:rPr>
-              <w:t>Webcursos</w:t>
-            </w:r>
-            <w:proofErr w:type="spellEnd"/>
-            <w:r>
-              <w:rPr>
-                <w:rFonts w:ascii="Calibri" w:eastAsia="Calibri" w:hAnsi="Calibri" w:cs="Calibri"/>
-                <w:color w:val="000000"/>
-                <w:sz w:val="20"/>
-                <w:szCs w:val="20"/>
-              </w:rPr>
-              <w:t>.</w:t>
+              <w:t>presentaciones, código y guías de ejercicios</w:t>
+            </w:r>
+            <w:r>
+              <w:rPr>
+                <w:rFonts w:ascii="Calibri" w:eastAsia="Calibri" w:hAnsi="Calibri" w:cs="Calibri"/>
+                <w:color w:val="000000"/>
+                <w:sz w:val="20"/>
+                <w:szCs w:val="20"/>
+              </w:rPr>
+              <w:t xml:space="preserve">) </w:t>
+            </w:r>
+            <w:r>
+              <w:rPr>
+                <w:rFonts w:ascii="Calibri" w:eastAsia="Calibri" w:hAnsi="Calibri" w:cs="Calibri"/>
+                <w:color w:val="000000"/>
+                <w:sz w:val="20"/>
+                <w:szCs w:val="20"/>
+              </w:rPr>
+              <w:t>estarán disponibles en Webcursos.</w:t>
             </w:r>
           </w:p>
         </w:tc>
@@ -3426,7 +3432,6 @@
           <w:sz w:val="20"/>
           <w:szCs w:val="20"/>
         </w:rPr>
-        <w:lastRenderedPageBreak/>
         <w:t xml:space="preserve">Este módulo </w:t>
       </w:r>
       <w:r>
@@ -3581,7 +3586,6 @@
                 <w:szCs w:val="20"/>
               </w:rPr>
             </w:pPr>
-            <w:proofErr w:type="spellStart"/>
             <w:r>
               <w:rPr>
                 <w:rFonts w:ascii="Calibri" w:eastAsia="Calibri" w:hAnsi="Calibri" w:cs="Calibri"/>
@@ -3592,7 +3596,6 @@
               </w:rPr>
               <w:t>N°</w:t>
             </w:r>
-            <w:proofErr w:type="spellEnd"/>
           </w:p>
         </w:tc>
         <w:tc>
@@ -3876,7 +3879,43 @@
                 <w:szCs w:val="20"/>
                 <w:lang w:val="es-CL" w:eastAsia="es-CL" w:bidi="ar-SA"/>
               </w:rPr>
-              <w:t>20:30</w:t>
+              <w:t>2</w:t>
+            </w:r>
+            <w:r>
+              <w:rPr>
+                <w:rFonts w:ascii="Calibri" w:eastAsia="Times New Roman" w:hAnsi="Calibri" w:cs="Calibri"/>
+                <w:sz w:val="20"/>
+                <w:szCs w:val="20"/>
+                <w:lang w:val="es-CL" w:eastAsia="es-CL" w:bidi="ar-SA"/>
+              </w:rPr>
+              <w:t>1</w:t>
+            </w:r>
+            <w:r>
+              <w:rPr>
+                <w:rFonts w:ascii="Calibri" w:eastAsia="Times New Roman" w:hAnsi="Calibri" w:cs="Calibri"/>
+                <w:sz w:val="20"/>
+                <w:szCs w:val="20"/>
+                <w:lang w:val="es-CL" w:eastAsia="es-CL" w:bidi="ar-SA"/>
+              </w:rPr>
+              <w:t>:</w:t>
+            </w:r>
+            <w:r>
+              <w:rPr>
+                <w:rFonts w:ascii="Calibri" w:eastAsia="Times New Roman" w:hAnsi="Calibri" w:cs="Calibri"/>
+                <w:sz w:val="20"/>
+                <w:szCs w:val="20"/>
+                <w:lang w:val="es-CL" w:eastAsia="es-CL" w:bidi="ar-SA"/>
+              </w:rPr>
+              <w:t>0</w:t>
+            </w:r>
+            <w:r>
+              <w:rPr>
+                <w:rFonts w:ascii="Calibri" w:eastAsia="Times New Roman" w:hAnsi="Calibri" w:cs="Calibri"/>
+                <w:sz w:val="20"/>
+                <w:szCs w:val="20"/>
+                <w:lang w:val="es-CL" w:eastAsia="es-CL" w:bidi="ar-SA"/>
+              </w:rPr>
+              <w:t>0</w:t>
             </w:r>
           </w:p>
         </w:tc>
@@ -4030,7 +4069,43 @@
                 <w:szCs w:val="20"/>
                 <w:lang w:val="es-CL" w:eastAsia="es-CL" w:bidi="ar-SA"/>
               </w:rPr>
-              <w:t>20:30</w:t>
+              <w:t>2</w:t>
+            </w:r>
+            <w:r>
+              <w:rPr>
+                <w:rFonts w:ascii="Calibri" w:eastAsia="Times New Roman" w:hAnsi="Calibri" w:cs="Calibri"/>
+                <w:sz w:val="20"/>
+                <w:szCs w:val="20"/>
+                <w:lang w:val="es-CL" w:eastAsia="es-CL" w:bidi="ar-SA"/>
+              </w:rPr>
+              <w:t>1</w:t>
+            </w:r>
+            <w:r>
+              <w:rPr>
+                <w:rFonts w:ascii="Calibri" w:eastAsia="Times New Roman" w:hAnsi="Calibri" w:cs="Calibri"/>
+                <w:sz w:val="20"/>
+                <w:szCs w:val="20"/>
+                <w:lang w:val="es-CL" w:eastAsia="es-CL" w:bidi="ar-SA"/>
+              </w:rPr>
+              <w:t>:</w:t>
+            </w:r>
+            <w:r>
+              <w:rPr>
+                <w:rFonts w:ascii="Calibri" w:eastAsia="Times New Roman" w:hAnsi="Calibri" w:cs="Calibri"/>
+                <w:sz w:val="20"/>
+                <w:szCs w:val="20"/>
+                <w:lang w:val="es-CL" w:eastAsia="es-CL" w:bidi="ar-SA"/>
+              </w:rPr>
+              <w:t>0</w:t>
+            </w:r>
+            <w:r>
+              <w:rPr>
+                <w:rFonts w:ascii="Calibri" w:eastAsia="Times New Roman" w:hAnsi="Calibri" w:cs="Calibri"/>
+                <w:sz w:val="20"/>
+                <w:szCs w:val="20"/>
+                <w:lang w:val="es-CL" w:eastAsia="es-CL" w:bidi="ar-SA"/>
+              </w:rPr>
+              <w:t>0</w:t>
             </w:r>
           </w:p>
         </w:tc>
@@ -4275,25 +4350,14 @@
               </w:rPr>
               <w:t xml:space="preserve">, 2nd Edition. </w:t>
             </w:r>
-            <w:proofErr w:type="spellStart"/>
-            <w:r>
-              <w:rPr>
-                <w:rFonts w:ascii="Calibri" w:eastAsia="Calibri" w:hAnsi="Calibri" w:cs="Calibri"/>
-                <w:color w:val="000000"/>
-                <w:sz w:val="20"/>
-                <w:szCs w:val="20"/>
-              </w:rPr>
-              <w:t>OpenIntro</w:t>
-            </w:r>
-            <w:proofErr w:type="spellEnd"/>
-            <w:r>
-              <w:rPr>
-                <w:rFonts w:ascii="Calibri" w:eastAsia="Calibri" w:hAnsi="Calibri" w:cs="Calibri"/>
-                <w:color w:val="000000"/>
-                <w:sz w:val="20"/>
-                <w:szCs w:val="20"/>
-              </w:rPr>
-              <w:t xml:space="preserve">. Disponible en: </w:t>
+            <w:r>
+              <w:rPr>
+                <w:rFonts w:ascii="Calibri" w:eastAsia="Calibri" w:hAnsi="Calibri" w:cs="Calibri"/>
+                <w:color w:val="000000"/>
+                <w:sz w:val="20"/>
+                <w:szCs w:val="20"/>
+              </w:rPr>
+              <w:t xml:space="preserve">OpenIntro. Disponible en: </w:t>
             </w:r>
             <w:hyperlink r:id="rId10" w:history="1">
               <w:r>
@@ -4376,7 +4440,27 @@
                 <w:szCs w:val="20"/>
                 <w:lang w:val="en-US"/>
               </w:rPr>
-              <w:t xml:space="preserve">(I&amp;K) Ismay, C., Kim, A.Y. &amp; Valdivia, A. (2025). </w:t>
+              <w:t>(</w:t>
+            </w:r>
+            <w:r>
+              <w:rPr>
+                <w:rFonts w:ascii="Calibri" w:eastAsia="Calibri" w:hAnsi="Calibri" w:cs="Calibri"/>
+                <w:color w:val="000000"/>
+                <w:sz w:val="20"/>
+                <w:szCs w:val="20"/>
+                <w:lang w:val="en-US"/>
+              </w:rPr>
+              <w:t>A</w:t>
+            </w:r>
+            <w:r>
+              <w:rPr>
+                <w:rFonts w:ascii="Calibri" w:eastAsia="Calibri" w:hAnsi="Calibri" w:cs="Calibri"/>
+                <w:color w:val="000000"/>
+                <w:sz w:val="20"/>
+                <w:szCs w:val="20"/>
+                <w:lang w:val="en-US"/>
+              </w:rPr>
+              <w:t xml:space="preserve">) Agresti, A. </w:t>
             </w:r>
             <w:r>
               <w:rPr>
@@ -4388,9 +4472,8 @@
                 <w:szCs w:val="20"/>
                 <w:lang w:val="en-US"/>
               </w:rPr>
-              <w:t xml:space="preserve">Statistical Inference via Data Science: A </w:t>
-            </w:r>
-            <w:proofErr w:type="spellStart"/>
+              <w:t>Statistical Methods for the</w:t>
+            </w:r>
             <w:r>
               <w:rPr>
                 <w:rFonts w:ascii="Calibri" w:eastAsia="Calibri" w:hAnsi="Calibri" w:cs="Calibri"/>
@@ -4401,9 +4484,8 @@
                 <w:szCs w:val="20"/>
                 <w:lang w:val="en-US"/>
               </w:rPr>
-              <w:t>ModernDive</w:t>
-            </w:r>
-            <w:proofErr w:type="spellEnd"/>
+              <w:t xml:space="preserve"> </w:t>
+            </w:r>
             <w:r>
               <w:rPr>
                 <w:rFonts w:ascii="Calibri" w:eastAsia="Calibri" w:hAnsi="Calibri" w:cs="Calibri"/>
@@ -4414,60 +4496,26 @@
                 <w:szCs w:val="20"/>
                 <w:lang w:val="en-US"/>
               </w:rPr>
-              <w:t xml:space="preserve"> into R and the </w:t>
-            </w:r>
-            <w:proofErr w:type="spellStart"/>
-            <w:r>
-              <w:rPr>
-                <w:rFonts w:ascii="Calibri" w:eastAsia="Calibri" w:hAnsi="Calibri" w:cs="Calibri"/>
-                <w:i/>
-                <w:iCs/>
+              <w:t>Social Sciences</w:t>
+            </w:r>
+            <w:r>
+              <w:rPr>
+                <w:rFonts w:ascii="Calibri" w:eastAsia="Calibri" w:hAnsi="Calibri" w:cs="Calibri"/>
                 <w:color w:val="000000"/>
                 <w:sz w:val="20"/>
                 <w:szCs w:val="20"/>
                 <w:lang w:val="en-US"/>
               </w:rPr>
-              <w:t>Tidyverse</w:t>
-            </w:r>
-            <w:proofErr w:type="spellEnd"/>
-            <w:r>
-              <w:rPr>
-                <w:rFonts w:ascii="Calibri" w:eastAsia="Calibri" w:hAnsi="Calibri" w:cs="Calibri"/>
-                <w:color w:val="000000"/>
-                <w:sz w:val="20"/>
-                <w:szCs w:val="20"/>
-                <w:lang w:val="en-US"/>
-              </w:rPr>
-              <w:t xml:space="preserve">, 2nd ed. </w:t>
-            </w:r>
-            <w:r>
-              <w:rPr>
-                <w:rFonts w:ascii="Calibri" w:eastAsia="Calibri" w:hAnsi="Calibri" w:cs="Calibri"/>
-                <w:color w:val="000000"/>
-                <w:sz w:val="20"/>
-                <w:szCs w:val="20"/>
-              </w:rPr>
-              <w:t xml:space="preserve">Chapman and Hall/CRC. Disponible en: </w:t>
-            </w:r>
-            <w:hyperlink r:id="rId11" w:history="1">
-              <w:r>
-                <w:rPr>
-                  <w:rStyle w:val="Hipervnculo"/>
-                  <w:rFonts w:ascii="Calibri" w:eastAsia="Calibri" w:hAnsi="Calibri" w:cs="Calibri"/>
-                  <w:sz w:val="20"/>
-                  <w:szCs w:val="20"/>
-                </w:rPr>
-                <w:t>https://moderndive.com/v2/index.html</w:t>
-              </w:r>
-            </w:hyperlink>
-            <w:r>
-              <w:rPr>
-                <w:rFonts w:ascii="Calibri" w:eastAsia="Calibri" w:hAnsi="Calibri" w:cs="Calibri"/>
-                <w:color w:val="000000"/>
-                <w:sz w:val="20"/>
-                <w:szCs w:val="20"/>
-              </w:rPr>
-              <w:t xml:space="preserve"> </w:t>
+              <w:t xml:space="preserve">, 5th ed. </w:t>
+            </w:r>
+            <w:r>
+              <w:rPr>
+                <w:rFonts w:ascii="Calibri" w:eastAsia="Calibri" w:hAnsi="Calibri" w:cs="Calibri"/>
+                <w:color w:val="000000"/>
+                <w:sz w:val="20"/>
+                <w:szCs w:val="20"/>
+              </w:rPr>
+              <w:t xml:space="preserve">Pearson. </w:t>
             </w:r>
             <w:r>
               <w:rPr>
@@ -4480,7 +4528,18 @@
                 <w:sz w:val="20"/>
                 <w:szCs w:val="20"/>
               </w:rPr>
-              <w:t>[Texto principal del Módulo II; revisarlo en paralelo facilita la transición].</w:t>
+              <w:t>[Referencia conceptual para estadística descriptiva e inferencial aplicada a ciencias sociales]</w:t>
+            </w:r>
+            <w:r>
+              <w:rPr>
+                <w:rFonts w:ascii="Calibri" w:eastAsia="Calibri" w:hAnsi="Calibri" w:cs="Calibri"/>
+                <w:i/>
+                <w:iCs/>
+                <w:color w:val="000000"/>
+                <w:sz w:val="20"/>
+                <w:szCs w:val="20"/>
+              </w:rPr>
+              <w:t>.</w:t>
             </w:r>
           </w:p>
           <w:p>
@@ -4517,27 +4576,7 @@
                 <w:szCs w:val="20"/>
                 <w:lang w:val="en-US"/>
               </w:rPr>
-              <w:t>(</w:t>
-            </w:r>
-            <w:r>
-              <w:rPr>
-                <w:rFonts w:ascii="Calibri" w:eastAsia="Calibri" w:hAnsi="Calibri" w:cs="Calibri"/>
-                <w:color w:val="000000"/>
-                <w:sz w:val="20"/>
-                <w:szCs w:val="20"/>
-                <w:lang w:val="en-US"/>
-              </w:rPr>
-              <w:t>A</w:t>
-            </w:r>
-            <w:r>
-              <w:rPr>
-                <w:rFonts w:ascii="Calibri" w:eastAsia="Calibri" w:hAnsi="Calibri" w:cs="Calibri"/>
-                <w:color w:val="000000"/>
-                <w:sz w:val="20"/>
-                <w:szCs w:val="20"/>
-                <w:lang w:val="en-US"/>
-              </w:rPr>
-              <w:t xml:space="preserve">) Agresti, A. </w:t>
+              <w:t xml:space="preserve">(I&amp;K) Ismay, C., Kim, A.Y. &amp; Valdivia, A. (2025). </w:t>
             </w:r>
             <w:r>
               <w:rPr>
@@ -4549,50 +4588,64 @@
                 <w:szCs w:val="20"/>
                 <w:lang w:val="en-US"/>
               </w:rPr>
-              <w:t>Statistical Methods for the</w:t>
-            </w:r>
-            <w:r>
-              <w:rPr>
-                <w:rFonts w:ascii="Calibri" w:eastAsia="Calibri" w:hAnsi="Calibri" w:cs="Calibri"/>
-                <w:i/>
-                <w:iCs/>
+              <w:t>Statistical Inference via Data Science: A ModernDive into R and the Tidyverse</w:t>
+            </w:r>
+            <w:r>
+              <w:rPr>
+                <w:rFonts w:ascii="Calibri" w:eastAsia="Calibri" w:hAnsi="Calibri" w:cs="Calibri"/>
                 <w:color w:val="000000"/>
                 <w:sz w:val="20"/>
                 <w:szCs w:val="20"/>
                 <w:lang w:val="en-US"/>
               </w:rPr>
+              <w:t xml:space="preserve">, 2nd ed. </w:t>
+            </w:r>
+            <w:r>
+              <w:rPr>
+                <w:rFonts w:ascii="Calibri" w:eastAsia="Calibri" w:hAnsi="Calibri" w:cs="Calibri"/>
+                <w:color w:val="000000"/>
+                <w:sz w:val="20"/>
+                <w:szCs w:val="20"/>
+              </w:rPr>
+              <w:t xml:space="preserve">Chapman and Hall/CRC. Disponible en: </w:t>
+            </w:r>
+            <w:hyperlink r:id="rId11" w:history="1">
+              <w:r>
+                <w:rPr>
+                  <w:rStyle w:val="Hipervnculo"/>
+                  <w:rFonts w:ascii="Calibri" w:eastAsia="Calibri" w:hAnsi="Calibri" w:cs="Calibri"/>
+                  <w:sz w:val="20"/>
+                  <w:szCs w:val="20"/>
+                </w:rPr>
+                <w:t>https://</w:t>
+              </w:r>
+              <w:r>
+                <w:rPr>
+                  <w:rStyle w:val="Hipervnculo"/>
+                  <w:rFonts w:ascii="Calibri" w:eastAsia="Calibri" w:hAnsi="Calibri" w:cs="Calibri"/>
+                  <w:sz w:val="20"/>
+                  <w:szCs w:val="20"/>
+                </w:rPr>
+                <w:t>m</w:t>
+              </w:r>
+              <w:r>
+                <w:rPr>
+                  <w:rStyle w:val="Hipervnculo"/>
+                  <w:rFonts w:ascii="Calibri" w:eastAsia="Calibri" w:hAnsi="Calibri" w:cs="Calibri"/>
+                  <w:sz w:val="20"/>
+                  <w:szCs w:val="20"/>
+                </w:rPr>
+                <w:t>oderndive.com/v2/index.html</w:t>
+              </w:r>
+            </w:hyperlink>
+            <w:r>
+              <w:rPr>
+                <w:rFonts w:ascii="Calibri" w:eastAsia="Calibri" w:hAnsi="Calibri" w:cs="Calibri"/>
+                <w:color w:val="000000"/>
+                <w:sz w:val="20"/>
+                <w:szCs w:val="20"/>
+              </w:rPr>
               <w:t xml:space="preserve"> </w:t>
-            </w:r>
-            <w:r>
-              <w:rPr>
-                <w:rFonts w:ascii="Calibri" w:eastAsia="Calibri" w:hAnsi="Calibri" w:cs="Calibri"/>
-                <w:i/>
-                <w:iCs/>
-                <w:color w:val="000000"/>
-                <w:sz w:val="20"/>
-                <w:szCs w:val="20"/>
-                <w:lang w:val="en-US"/>
-              </w:rPr>
-              <w:t>Social Sciences</w:t>
-            </w:r>
-            <w:r>
-              <w:rPr>
-                <w:rFonts w:ascii="Calibri" w:eastAsia="Calibri" w:hAnsi="Calibri" w:cs="Calibri"/>
-                <w:color w:val="000000"/>
-                <w:sz w:val="20"/>
-                <w:szCs w:val="20"/>
-                <w:lang w:val="en-US"/>
-              </w:rPr>
-              <w:t xml:space="preserve">, 5th ed. </w:t>
-            </w:r>
-            <w:r>
-              <w:rPr>
-                <w:rFonts w:ascii="Calibri" w:eastAsia="Calibri" w:hAnsi="Calibri" w:cs="Calibri"/>
-                <w:color w:val="000000"/>
-                <w:sz w:val="20"/>
-                <w:szCs w:val="20"/>
-              </w:rPr>
-              <w:t xml:space="preserve">Pearson. </w:t>
             </w:r>
             <w:r>
               <w:rPr>
@@ -4605,18 +4658,7 @@
                 <w:sz w:val="20"/>
                 <w:szCs w:val="20"/>
               </w:rPr>
-              <w:t>[Referencia conceptual para estadística descriptiva e inferencial aplicada a ciencias sociales]</w:t>
-            </w:r>
-            <w:r>
-              <w:rPr>
-                <w:rFonts w:ascii="Calibri" w:eastAsia="Calibri" w:hAnsi="Calibri" w:cs="Calibri"/>
-                <w:i/>
-                <w:iCs/>
-                <w:color w:val="000000"/>
-                <w:sz w:val="20"/>
-                <w:szCs w:val="20"/>
-              </w:rPr>
-              <w:t>.</w:t>
+              <w:t>[Texto principal del Módulo II; revisarlo en paralelo facilita la transición].</w:t>
             </w:r>
           </w:p>
           <w:p>
@@ -4705,30 +4747,16 @@
                 <w:szCs w:val="20"/>
                 <w:lang w:val="en-US"/>
               </w:rPr>
-              <w:t xml:space="preserve">Quantitative Social Science: An Introduction with </w:t>
-            </w:r>
-            <w:proofErr w:type="spellStart"/>
-            <w:r>
-              <w:rPr>
-                <w:rFonts w:ascii="Calibri" w:eastAsia="Calibri" w:hAnsi="Calibri" w:cs="Calibri"/>
-                <w:i/>
-                <w:iCs/>
+              <w:t>Quantitative Social Science: An Introduction with Tidyverse</w:t>
+            </w:r>
+            <w:r>
+              <w:rPr>
+                <w:rFonts w:ascii="Calibri" w:eastAsia="Calibri" w:hAnsi="Calibri" w:cs="Calibri"/>
                 <w:color w:val="000000"/>
                 <w:sz w:val="20"/>
                 <w:szCs w:val="20"/>
                 <w:lang w:val="en-US"/>
               </w:rPr>
-              <w:t>Tidyverse</w:t>
-            </w:r>
-            <w:proofErr w:type="spellEnd"/>
-            <w:r>
-              <w:rPr>
-                <w:rFonts w:ascii="Calibri" w:eastAsia="Calibri" w:hAnsi="Calibri" w:cs="Calibri"/>
-                <w:color w:val="000000"/>
-                <w:sz w:val="20"/>
-                <w:szCs w:val="20"/>
-                <w:lang w:val="en-US"/>
-              </w:rPr>
               <w:t xml:space="preserve">. </w:t>
             </w:r>
             <w:r>
@@ -4738,47 +4766,16 @@
                 <w:sz w:val="20"/>
                 <w:szCs w:val="20"/>
               </w:rPr>
-              <w:t xml:space="preserve">Princeton </w:t>
-            </w:r>
-            <w:proofErr w:type="spellStart"/>
-            <w:r>
-              <w:rPr>
-                <w:rFonts w:ascii="Calibri" w:eastAsia="Calibri" w:hAnsi="Calibri" w:cs="Calibri"/>
-                <w:color w:val="000000"/>
-                <w:sz w:val="20"/>
-                <w:szCs w:val="20"/>
-              </w:rPr>
-              <w:t>University</w:t>
-            </w:r>
-            <w:proofErr w:type="spellEnd"/>
-            <w:r>
-              <w:rPr>
-                <w:rFonts w:ascii="Calibri" w:eastAsia="Calibri" w:hAnsi="Calibri" w:cs="Calibri"/>
-                <w:color w:val="000000"/>
-                <w:sz w:val="20"/>
-                <w:szCs w:val="20"/>
-              </w:rPr>
-              <w:t xml:space="preserve"> Press. </w:t>
-            </w:r>
-            <w:r>
-              <w:rPr>
-                <w:rFonts w:ascii="Calibri" w:eastAsia="Calibri" w:hAnsi="Calibri" w:cs="Calibri"/>
-                <w:i/>
-                <w:iCs/>
-                <w:color w:val="000000"/>
-                <w:sz w:val="20"/>
-                <w:szCs w:val="20"/>
-              </w:rPr>
-              <w:t>[Para ejemplos de probabilidad aplicada y simulación en R, incluyendo la paradoja del cumpleaños]</w:t>
-            </w:r>
-            <w:r>
-              <w:rPr>
-                <w:rFonts w:ascii="Calibri" w:eastAsia="Calibri" w:hAnsi="Calibri" w:cs="Calibri"/>
-                <w:color w:val="000000"/>
-                <w:sz w:val="20"/>
-                <w:szCs w:val="20"/>
-              </w:rPr>
-              <w:t xml:space="preserve">. </w:t>
+              <w:t>Princeton University Press.</w:t>
+            </w:r>
+            <w:r>
+              <w:rPr>
+                <w:rFonts w:ascii="Calibri" w:eastAsia="Calibri" w:hAnsi="Calibri" w:cs="Calibri"/>
+                <w:color w:val="000000"/>
+                <w:sz w:val="20"/>
+                <w:szCs w:val="20"/>
+              </w:rPr>
+              <w:t xml:space="preserve"> </w:t>
             </w:r>
             <w:r>
               <w:rPr>

</xml_diff>